<commit_message>
Added runtime graphs to report
</commit_message>
<xml_diff>
--- a/Documents/Project Report (k224173, k224406, k224625).docx
+++ b/Documents/Project Report (k224173, k224406, k224625).docx
@@ -130,6 +130,7 @@
     <w:p>
       <w:pPr>
         <w:numPr>
+          <w:ilvl w:val="0"/>
           <w:numId w:val="0"/>
         </w:numPr>
         <w:ind w:leftChars="0"/>
@@ -250,6 +251,7 @@
     <w:p>
       <w:pPr>
         <w:numPr>
+          <w:ilvl w:val="0"/>
           <w:numId w:val="0"/>
         </w:numPr>
         <w:spacing w:line="276" w:lineRule="auto"/>
@@ -266,6 +268,7 @@
     <w:p>
       <w:pPr>
         <w:numPr>
+          <w:ilvl w:val="0"/>
           <w:numId w:val="0"/>
         </w:numPr>
         <w:spacing w:line="276" w:lineRule="auto"/>
@@ -293,6 +296,7 @@
     <w:p>
       <w:pPr>
         <w:numPr>
+          <w:ilvl w:val="0"/>
           <w:numId w:val="0"/>
         </w:numPr>
         <w:spacing w:line="276" w:lineRule="auto"/>
@@ -864,6 +868,7 @@
     <w:p>
       <w:pPr>
         <w:numPr>
+          <w:ilvl w:val="0"/>
           <w:numId w:val="0"/>
         </w:numPr>
       </w:pPr>
@@ -875,7 +880,7 @@
           <w:szCs w:val="24"/>
           <w:lang w:val="en-US"/>
         </w:rPr>
-        <w:t>5. Speedup and Efficiency Graphs:</w:t>
+        <w:t>5. Runtimes, Speedup and Efficiency Graphs:</w:t>
       </w:r>
       <w:r>
         <w:rPr>
@@ -890,9 +895,9 @@
       <w:r>
         <w:drawing>
           <wp:inline distT="0" distB="0" distL="114300" distR="114300">
-            <wp:extent cx="6638290" cy="3734435"/>
-            <wp:effectExtent l="0" t="0" r="3810" b="12065"/>
-            <wp:docPr id="1" name="Picture 1"/>
+            <wp:extent cx="6638290" cy="3526790"/>
+            <wp:effectExtent l="9525" t="9525" r="19685" b="19685"/>
+            <wp:docPr id="5" name="Picture 3"/>
             <wp:cNvGraphicFramePr>
               <a:graphicFrameLocks xmlns:a="http://schemas.openxmlformats.org/drawingml/2006/main" noChangeAspect="1"/>
             </wp:cNvGraphicFramePr>
@@ -900,13 +905,210 @@
               <a:graphicData uri="http://schemas.openxmlformats.org/drawingml/2006/picture">
                 <pic:pic xmlns:pic="http://schemas.openxmlformats.org/drawingml/2006/picture">
                   <pic:nvPicPr>
-                    <pic:cNvPr id="1" name="Picture 1"/>
+                    <pic:cNvPr id="5" name="Picture 3"/>
                     <pic:cNvPicPr>
                       <a:picLocks noChangeAspect="1"/>
                     </pic:cNvPicPr>
                   </pic:nvPicPr>
                   <pic:blipFill>
                     <a:blip r:embed="rId6"/>
+                    <a:stretch>
+                      <a:fillRect/>
+                    </a:stretch>
+                  </pic:blipFill>
+                  <pic:spPr>
+                    <a:xfrm>
+                      <a:off x="0" y="0"/>
+                      <a:ext cx="6638290" cy="3526790"/>
+                    </a:xfrm>
+                    <a:prstGeom prst="rect">
+                      <a:avLst/>
+                    </a:prstGeom>
+                    <a:noFill/>
+                    <a:ln>
+                      <a:solidFill>
+                        <a:schemeClr val="tx1"/>
+                      </a:solidFill>
+                    </a:ln>
+                  </pic:spPr>
+                </pic:pic>
+              </a:graphicData>
+            </a:graphic>
+          </wp:inline>
+        </w:drawing>
+      </w:r>
+      <w:r>
+        <w:br w:type="textWrapping"/>
+      </w:r>
+      <w:r>
+        <w:br w:type="textWrapping"/>
+      </w:r>
+      <w:r>
+        <w:drawing>
+          <wp:inline distT="0" distB="0" distL="114300" distR="114300">
+            <wp:extent cx="6638290" cy="3526790"/>
+            <wp:effectExtent l="9525" t="9525" r="19685" b="19685"/>
+            <wp:docPr id="4" name="Picture 2"/>
+            <wp:cNvGraphicFramePr>
+              <a:graphicFrameLocks xmlns:a="http://schemas.openxmlformats.org/drawingml/2006/main" noChangeAspect="1"/>
+            </wp:cNvGraphicFramePr>
+            <a:graphic xmlns:a="http://schemas.openxmlformats.org/drawingml/2006/main">
+              <a:graphicData uri="http://schemas.openxmlformats.org/drawingml/2006/picture">
+                <pic:pic xmlns:pic="http://schemas.openxmlformats.org/drawingml/2006/picture">
+                  <pic:nvPicPr>
+                    <pic:cNvPr id="4" name="Picture 2"/>
+                    <pic:cNvPicPr>
+                      <a:picLocks noChangeAspect="1"/>
+                    </pic:cNvPicPr>
+                  </pic:nvPicPr>
+                  <pic:blipFill>
+                    <a:blip r:embed="rId7"/>
+                    <a:stretch>
+                      <a:fillRect/>
+                    </a:stretch>
+                  </pic:blipFill>
+                  <pic:spPr>
+                    <a:xfrm>
+                      <a:off x="0" y="0"/>
+                      <a:ext cx="6638290" cy="3526790"/>
+                    </a:xfrm>
+                    <a:prstGeom prst="rect">
+                      <a:avLst/>
+                    </a:prstGeom>
+                    <a:noFill/>
+                    <a:ln>
+                      <a:solidFill>
+                        <a:schemeClr val="tx1"/>
+                      </a:solidFill>
+                    </a:ln>
+                  </pic:spPr>
+                </pic:pic>
+              </a:graphicData>
+            </a:graphic>
+          </wp:inline>
+        </w:drawing>
+      </w:r>
+      <w:r>
+        <w:br w:type="textWrapping"/>
+      </w:r>
+      <w:r>
+        <w:br w:type="textWrapping"/>
+      </w:r>
+    </w:p>
+    <w:p>
+      <w:r>
+        <w:br w:type="page"/>
+      </w:r>
+    </w:p>
+    <w:p>
+      <w:pPr>
+        <w:numPr>
+          <w:ilvl w:val="0"/>
+          <w:numId w:val="0"/>
+        </w:numPr>
+      </w:pPr>
+      <w:r>
+        <w:rPr>
+          <w:rFonts w:hint="default" w:ascii="Ebrima" w:hAnsi="Ebrima" w:cs="Ebrima"/>
+          <w:b/>
+          <w:sz w:val="24"/>
+          <w:szCs w:val="24"/>
+          <w:lang w:val="en-US"/>
+        </w:rPr>
+        <w:t>5. Runtimes, Speedup and Efficiency Graphs:</w:t>
+      </w:r>
+      <w:r>
+        <w:rPr>
+          <w:rFonts w:hint="default" w:ascii="Ebrima" w:hAnsi="Ebrima" w:cs="Ebrima"/>
+          <w:b/>
+          <w:sz w:val="24"/>
+          <w:szCs w:val="24"/>
+          <w:lang w:val="en-US"/>
+        </w:rPr>
+        <w:br w:type="textWrapping"/>
+      </w:r>
+      <w:bookmarkStart w:id="0" w:name="_GoBack"/>
+      <w:r>
+        <w:drawing>
+          <wp:inline distT="0" distB="0" distL="114300" distR="114300">
+            <wp:extent cx="6638290" cy="3526790"/>
+            <wp:effectExtent l="9525" t="9525" r="19685" b="19685"/>
+            <wp:docPr id="6" name="Picture 4"/>
+            <wp:cNvGraphicFramePr>
+              <a:graphicFrameLocks xmlns:a="http://schemas.openxmlformats.org/drawingml/2006/main" noChangeAspect="1"/>
+            </wp:cNvGraphicFramePr>
+            <a:graphic xmlns:a="http://schemas.openxmlformats.org/drawingml/2006/main">
+              <a:graphicData uri="http://schemas.openxmlformats.org/drawingml/2006/picture">
+                <pic:pic xmlns:pic="http://schemas.openxmlformats.org/drawingml/2006/picture">
+                  <pic:nvPicPr>
+                    <pic:cNvPr id="6" name="Picture 4"/>
+                    <pic:cNvPicPr>
+                      <a:picLocks noChangeAspect="1"/>
+                    </pic:cNvPicPr>
+                  </pic:nvPicPr>
+                  <pic:blipFill>
+                    <a:blip r:embed="rId8"/>
+                    <a:stretch>
+                      <a:fillRect/>
+                    </a:stretch>
+                  </pic:blipFill>
+                  <pic:spPr>
+                    <a:xfrm>
+                      <a:off x="0" y="0"/>
+                      <a:ext cx="6638290" cy="3526790"/>
+                    </a:xfrm>
+                    <a:prstGeom prst="rect">
+                      <a:avLst/>
+                    </a:prstGeom>
+                    <a:noFill/>
+                    <a:ln>
+                      <a:solidFill>
+                        <a:schemeClr val="tx1"/>
+                      </a:solidFill>
+                    </a:ln>
+                  </pic:spPr>
+                </pic:pic>
+              </a:graphicData>
+            </a:graphic>
+          </wp:inline>
+        </w:drawing>
+      </w:r>
+      <w:bookmarkEnd w:id="0"/>
+      <w:r>
+        <w:br w:type="textWrapping"/>
+      </w:r>
+    </w:p>
+    <w:p>
+      <w:pPr>
+        <w:numPr>
+          <w:ilvl w:val="0"/>
+          <w:numId w:val="0"/>
+        </w:numPr>
+        <w:rPr>
+          <w:rFonts w:hint="default"/>
+          <w:lang w:val="en-US"/>
+        </w:rPr>
+      </w:pPr>
+      <w:r>
+        <w:drawing>
+          <wp:inline distT="0" distB="0" distL="114300" distR="114300">
+            <wp:extent cx="6638290" cy="3734435"/>
+            <wp:effectExtent l="9525" t="9525" r="19685" b="15240"/>
+            <wp:docPr id="2" name="Picture 2"/>
+            <wp:cNvGraphicFramePr>
+              <a:graphicFrameLocks xmlns:a="http://schemas.openxmlformats.org/drawingml/2006/main" noChangeAspect="1"/>
+            </wp:cNvGraphicFramePr>
+            <a:graphic xmlns:a="http://schemas.openxmlformats.org/drawingml/2006/main">
+              <a:graphicData uri="http://schemas.openxmlformats.org/drawingml/2006/picture">
+                <pic:pic xmlns:pic="http://schemas.openxmlformats.org/drawingml/2006/picture">
+                  <pic:nvPicPr>
+                    <pic:cNvPr id="2" name="Picture 2"/>
+                    <pic:cNvPicPr>
+                      <a:picLocks noChangeAspect="1"/>
+                    </pic:cNvPicPr>
+                  </pic:nvPicPr>
+                  <pic:blipFill>
+                    <a:blip r:embed="rId9"/>
                     <a:stretch>
                       <a:fillRect/>
                     </a:stretch>
@@ -938,63 +1140,6 @@
     </w:p>
     <w:p>
       <w:pPr>
-        <w:numPr>
-          <w:numId w:val="0"/>
-        </w:numPr>
-        <w:rPr>
-          <w:rFonts w:hint="default"/>
-          <w:lang w:val="en-US"/>
-        </w:rPr>
-      </w:pPr>
-      <w:r>
-        <w:drawing>
-          <wp:inline distT="0" distB="0" distL="114300" distR="114300">
-            <wp:extent cx="6638290" cy="3734435"/>
-            <wp:effectExtent l="0" t="0" r="3810" b="12065"/>
-            <wp:docPr id="2" name="Picture 2"/>
-            <wp:cNvGraphicFramePr>
-              <a:graphicFrameLocks xmlns:a="http://schemas.openxmlformats.org/drawingml/2006/main" noChangeAspect="1"/>
-            </wp:cNvGraphicFramePr>
-            <a:graphic xmlns:a="http://schemas.openxmlformats.org/drawingml/2006/main">
-              <a:graphicData uri="http://schemas.openxmlformats.org/drawingml/2006/picture">
-                <pic:pic xmlns:pic="http://schemas.openxmlformats.org/drawingml/2006/picture">
-                  <pic:nvPicPr>
-                    <pic:cNvPr id="2" name="Picture 2"/>
-                    <pic:cNvPicPr>
-                      <a:picLocks noChangeAspect="1"/>
-                    </pic:cNvPicPr>
-                  </pic:nvPicPr>
-                  <pic:blipFill>
-                    <a:blip r:embed="rId7"/>
-                    <a:stretch>
-                      <a:fillRect/>
-                    </a:stretch>
-                  </pic:blipFill>
-                  <pic:spPr>
-                    <a:xfrm>
-                      <a:off x="0" y="0"/>
-                      <a:ext cx="6638290" cy="3734435"/>
-                    </a:xfrm>
-                    <a:prstGeom prst="rect">
-                      <a:avLst/>
-                    </a:prstGeom>
-                    <a:noFill/>
-                    <a:ln>
-                      <a:noFill/>
-                    </a:ln>
-                  </pic:spPr>
-                </pic:pic>
-              </a:graphicData>
-            </a:graphic>
-          </wp:inline>
-        </w:drawing>
-      </w:r>
-      <w:r>
-        <w:br w:type="textWrapping"/>
-      </w:r>
-    </w:p>
-    <w:p>
-      <w:pPr>
         <w:rPr>
           <w:rFonts w:hint="default" w:ascii="Ebrima" w:hAnsi="Ebrima" w:cs="Ebrima"/>
           <w:sz w:val="20"/>
@@ -1315,6 +1460,7 @@
     <w:p>
       <w:pPr>
         <w:numPr>
+          <w:ilvl w:val="0"/>
           <w:numId w:val="0"/>
         </w:numPr>
         <w:spacing w:line="276" w:lineRule="auto"/>
@@ -1452,6 +1598,7 @@
     <w:p>
       <w:pPr>
         <w:numPr>
+          <w:ilvl w:val="0"/>
           <w:numId w:val="0"/>
         </w:numPr>
         <w:spacing w:line="276" w:lineRule="auto"/>
@@ -1709,8 +1856,6 @@
         </w:rPr>
         <w:t>22k-4625</w:t>
       </w:r>
-      <w:bookmarkStart w:id="0" w:name="_GoBack"/>
-      <w:bookmarkEnd w:id="0"/>
       <w:r>
         <w:rPr>
           <w:rFonts w:hint="default" w:ascii="Ebrima" w:hAnsi="Ebrima" w:cs="Ebrima"/>

</xml_diff>